<commit_message>
add print as pdf file feature
</commit_message>
<xml_diff>
--- a/template/complaints_template.docx
+++ b/template/complaints_template.docx
@@ -527,6 +527,19 @@
           <w:rtl/>
           <w:lang w:bidi="ar-EG"/>
         </w:rPr>
+        <w:t xml:space="preserve">بيانات </w:t>
+      </w:r>
+      <w:r>
+        <w:rPr>
+          <w:rFonts w:asciiTheme="majorBidi" w:hAnsiTheme="majorBidi" w:cstheme="majorBidi" w:hint="cs"/>
+          <w:b/>
+          <w:bCs/>
+          <w:sz w:val="28"/>
+          <w:szCs w:val="28"/>
+          <w:u w:val="single"/>
+          <w:rtl/>
+          <w:lang w:bidi="ar-EG"/>
+        </w:rPr>
         <w:t>مقدم</w:t>
       </w:r>
       <w:r>
@@ -1041,6 +1054,7 @@
     <w:p>
       <w:pPr>
         <w:spacing w:before="240" w:after="0"/>
+        <w:jc w:val="right"/>
         <w:rPr>
           <w:rFonts w:asciiTheme="majorBidi" w:hAnsiTheme="majorBidi" w:cstheme="majorBidi"/>
           <w:sz w:val="24"/>
@@ -1059,6 +1073,560 @@
           <w:lang w:bidi="ar-EG"/>
         </w:rPr>
       </w:pPr>
+      <w:r>
+        <w:rPr>
+          <w:rFonts w:asciiTheme="majorBidi" w:hAnsiTheme="majorBidi" w:cstheme="majorBidi"/>
+          <w:noProof/>
+          <w:sz w:val="24"/>
+          <w:szCs w:val="24"/>
+          <w:lang w:bidi="ar-EG"/>
+        </w:rPr>
+        <mc:AlternateContent>
+          <mc:Choice Requires="wps">
+            <w:drawing>
+              <wp:anchor distT="45720" distB="45720" distL="114300" distR="114300" simplePos="0" relativeHeight="251659264" behindDoc="0" locked="0" layoutInCell="1" allowOverlap="1" wp14:anchorId="518920C9" wp14:editId="774E9C69">
+                <wp:simplePos x="0" y="0"/>
+                <wp:positionH relativeFrom="margin">
+                  <wp:align>left</wp:align>
+                </wp:positionH>
+                <wp:positionV relativeFrom="paragraph">
+                  <wp:posOffset>148362</wp:posOffset>
+                </wp:positionV>
+                <wp:extent cx="2360930" cy="1404620"/>
+                <wp:effectExtent l="0" t="0" r="0" b="0"/>
+                <wp:wrapSquare wrapText="bothSides"/>
+                <wp:docPr id="217" name="Text Box 2"/>
+                <wp:cNvGraphicFramePr>
+                  <a:graphicFrameLocks xmlns:a="http://schemas.openxmlformats.org/drawingml/2006/main"/>
+                </wp:cNvGraphicFramePr>
+                <a:graphic xmlns:a="http://schemas.openxmlformats.org/drawingml/2006/main">
+                  <a:graphicData uri="http://schemas.microsoft.com/office/word/2010/wordprocessingShape">
+                    <wps:wsp>
+                      <wps:cNvSpPr txBox="1">
+                        <a:spLocks noChangeArrowheads="1"/>
+                      </wps:cNvSpPr>
+                      <wps:spPr bwMode="auto">
+                        <a:xfrm>
+                          <a:off x="0" y="0"/>
+                          <a:ext cx="2360930" cy="1404620"/>
+                        </a:xfrm>
+                        <a:prstGeom prst="rect">
+                          <a:avLst/>
+                        </a:prstGeom>
+                        <a:noFill/>
+                        <a:ln w="9525">
+                          <a:noFill/>
+                          <a:miter lim="800000"/>
+                          <a:headEnd/>
+                          <a:tailEnd/>
+                        </a:ln>
+                      </wps:spPr>
+                      <wps:txbx>
+                        <w:txbxContent>
+                          <w:p>
+                            <w:pPr>
+                              <w:spacing w:before="240" w:after="0"/>
+                              <w:rPr>
+                                <w:rFonts w:asciiTheme="majorBidi" w:hAnsiTheme="majorBidi" w:cstheme="majorBidi"/>
+                                <w:b/>
+                                <w:bCs/>
+                                <w:sz w:val="28"/>
+                                <w:szCs w:val="28"/>
+                                <w:u w:val="single"/>
+                                <w:rtl/>
+                                <w:lang w:bidi="ar-EG"/>
+                              </w:rPr>
+                            </w:pPr>
+                            <w:r>
+                              <w:rPr>
+                                <w:rFonts w:asciiTheme="majorBidi" w:hAnsiTheme="majorBidi" w:cstheme="majorBidi" w:hint="cs"/>
+                                <w:b/>
+                                <w:bCs/>
+                                <w:sz w:val="28"/>
+                                <w:szCs w:val="28"/>
+                                <w:u w:val="single"/>
+                                <w:rtl/>
+                                <w:lang w:bidi="ar-EG"/>
+                              </w:rPr>
+                              <w:t>بيانات مستلم</w:t>
+                            </w:r>
+                            <w:r>
+                              <w:rPr>
+                                <w:rFonts w:asciiTheme="majorBidi" w:hAnsiTheme="majorBidi" w:cstheme="majorBidi"/>
+                                <w:b/>
+                                <w:bCs/>
+                                <w:sz w:val="28"/>
+                                <w:szCs w:val="28"/>
+                                <w:u w:val="single"/>
+                                <w:rtl/>
+                                <w:lang w:bidi="ar-EG"/>
+                              </w:rPr>
+                              <w:t xml:space="preserve"> الشك</w:t>
+                            </w:r>
+                            <w:r>
+                              <w:rPr>
+                                <w:rFonts w:asciiTheme="majorBidi" w:hAnsiTheme="majorBidi" w:cstheme="majorBidi" w:hint="cs"/>
+                                <w:b/>
+                                <w:bCs/>
+                                <w:sz w:val="28"/>
+                                <w:szCs w:val="28"/>
+                                <w:u w:val="single"/>
+                                <w:rtl/>
+                                <w:lang w:bidi="ar-EG"/>
+                              </w:rPr>
+                              <w:t>وى</w:t>
+                            </w:r>
+                          </w:p>
+                          <w:p>
+                            <w:pPr>
+                              <w:spacing w:before="240" w:after="0"/>
+                              <w:rPr>
+                                <w:rFonts w:asciiTheme="majorBidi" w:hAnsiTheme="majorBidi" w:cstheme="majorBidi"/>
+                                <w:b/>
+                                <w:bCs/>
+                                <w:sz w:val="24"/>
+                                <w:szCs w:val="24"/>
+                                <w:lang w:bidi="ar-EG"/>
+                              </w:rPr>
+                            </w:pPr>
+                            <w:r>
+                              <w:rPr>
+                                <w:rFonts w:asciiTheme="majorBidi" w:hAnsiTheme="majorBidi" w:cstheme="majorBidi"/>
+                                <w:sz w:val="24"/>
+                                <w:szCs w:val="24"/>
+                                <w:rtl/>
+                                <w:lang w:bidi="ar-EG"/>
+                              </w:rPr>
+                              <w:t xml:space="preserve">الاسم: </w:t>
+                            </w:r>
+                            <w:sdt>
+                              <w:sdtPr>
+                                <w:rPr>
+                                  <w:rFonts w:asciiTheme="majorBidi" w:hAnsiTheme="majorBidi" w:cstheme="majorBidi"/>
+                                  <w:b/>
+                                  <w:bCs/>
+                                  <w:sz w:val="24"/>
+                                  <w:szCs w:val="24"/>
+                                  <w:rtl/>
+                                  <w:lang w:bidi="ar-EG"/>
+                                </w:rPr>
+                                <w:alias w:val="username"/>
+                                <w:tag w:val="text"/>
+                                <w:id w:val="-1499108769"/>
+                                <w:placeholder>
+                                  <w:docPart w:val="01B8053722134568AC3B9A6CBF5C8051"/>
+                                </w:placeholder>
+                                <w15:color w:val="000000"/>
+                                <w:text/>
+                              </w:sdtPr>
+                              <w:sdtContent>
+                                <w:r>
+                                  <w:rPr>
+                                    <w:rFonts w:asciiTheme="majorBidi" w:hAnsiTheme="majorBidi" w:cstheme="majorBidi"/>
+                                    <w:b/>
+                                    <w:bCs/>
+                                    <w:sz w:val="24"/>
+                                    <w:szCs w:val="24"/>
+                                    <w:lang w:bidi="ar-EG"/>
+                                  </w:rPr>
+                                  <w:t>NAME</w:t>
+                                </w:r>
+                              </w:sdtContent>
+                            </w:sdt>
+                          </w:p>
+                          <w:p>
+                            <w:pPr>
+                              <w:spacing w:before="240" w:after="0"/>
+                              <w:rPr>
+                                <w:rFonts w:asciiTheme="majorBidi" w:hAnsiTheme="majorBidi" w:cstheme="majorBidi"/>
+                                <w:b/>
+                                <w:bCs/>
+                                <w:sz w:val="24"/>
+                                <w:szCs w:val="24"/>
+                                <w:rtl/>
+                                <w:lang w:bidi="ar-EG"/>
+                              </w:rPr>
+                            </w:pPr>
+                            <w:r>
+                              <w:rPr>
+                                <w:rFonts w:asciiTheme="majorBidi" w:hAnsiTheme="majorBidi" w:cstheme="majorBidi" w:hint="cs"/>
+                                <w:sz w:val="24"/>
+                                <w:szCs w:val="24"/>
+                                <w:rtl/>
+                                <w:lang w:bidi="ar-EG"/>
+                              </w:rPr>
+                              <w:t>الرقم القومي</w:t>
+                            </w:r>
+                            <w:r>
+                              <w:rPr>
+                                <w:rFonts w:asciiTheme="majorBidi" w:hAnsiTheme="majorBidi" w:cstheme="majorBidi" w:hint="cs"/>
+                                <w:sz w:val="24"/>
+                                <w:szCs w:val="24"/>
+                                <w:rtl/>
+                                <w:lang w:bidi="ar-EG"/>
+                              </w:rPr>
+                              <w:t xml:space="preserve">: </w:t>
+                            </w:r>
+                            <w:sdt>
+                              <w:sdtPr>
+                                <w:rPr>
+                                  <w:rFonts w:asciiTheme="majorBidi" w:hAnsiTheme="majorBidi" w:cstheme="majorBidi" w:hint="cs"/>
+                                  <w:b/>
+                                  <w:bCs/>
+                                  <w:sz w:val="24"/>
+                                  <w:szCs w:val="24"/>
+                                  <w:rtl/>
+                                  <w:lang w:bidi="ar-EG"/>
+                                </w:rPr>
+                                <w:alias w:val="user_nationalId"/>
+                                <w:tag w:val="text"/>
+                                <w:id w:val="104402682"/>
+                                <w:placeholder>
+                                  <w:docPart w:val="01B8053722134568AC3B9A6CBF5C8051"/>
+                                </w:placeholder>
+                                <w15:color w:val="000000"/>
+                                <w:text/>
+                              </w:sdtPr>
+                              <w:sdtContent>
+                                <w:r>
+                                  <w:rPr>
+                                    <w:rFonts w:asciiTheme="majorBidi" w:hAnsiTheme="majorBidi" w:cstheme="majorBidi"/>
+                                    <w:b/>
+                                    <w:bCs/>
+                                    <w:sz w:val="24"/>
+                                    <w:szCs w:val="24"/>
+                                    <w:lang w:bidi="ar-EG"/>
+                                  </w:rPr>
+                                  <w:t>NATIONALID</w:t>
+                                </w:r>
+                              </w:sdtContent>
+                            </w:sdt>
+                          </w:p>
+                          <w:p>
+                            <w:pPr>
+                              <w:spacing w:before="240" w:after="0"/>
+                              <w:rPr>
+                                <w:rFonts w:asciiTheme="majorBidi" w:hAnsiTheme="majorBidi" w:cstheme="majorBidi"/>
+                                <w:sz w:val="24"/>
+                                <w:szCs w:val="24"/>
+                                <w:lang w:bidi="ar-EG"/>
+                              </w:rPr>
+                            </w:pPr>
+                            <w:r>
+                              <w:rPr>
+                                <w:rFonts w:asciiTheme="majorBidi" w:hAnsiTheme="majorBidi" w:cstheme="majorBidi"/>
+                                <w:sz w:val="24"/>
+                                <w:szCs w:val="24"/>
+                                <w:rtl/>
+                                <w:lang w:bidi="ar-EG"/>
+                              </w:rPr>
+                              <w:t xml:space="preserve">رقم الهاتف: </w:t>
+                            </w:r>
+                            <w:sdt>
+                              <w:sdtPr>
+                                <w:rPr>
+                                  <w:rFonts w:asciiTheme="majorBidi" w:hAnsiTheme="majorBidi" w:cstheme="majorBidi"/>
+                                  <w:b/>
+                                  <w:bCs/>
+                                  <w:sz w:val="24"/>
+                                  <w:szCs w:val="24"/>
+                                  <w:rtl/>
+                                  <w:lang w:bidi="ar-EG"/>
+                                </w:rPr>
+                                <w:alias w:val="user_phone"/>
+                                <w:tag w:val="text"/>
+                                <w:id w:val="-869294125"/>
+                                <w:placeholder>
+                                  <w:docPart w:val="154DBF0B8BCE4AD2B8282BFB2F773B39"/>
+                                </w:placeholder>
+                                <w15:color w:val="000000"/>
+                                <w:text/>
+                              </w:sdtPr>
+                              <w:sdtContent>
+                                <w:r>
+                                  <w:rPr>
+                                    <w:rFonts w:asciiTheme="majorBidi" w:hAnsiTheme="majorBidi" w:cstheme="majorBidi"/>
+                                    <w:b/>
+                                    <w:bCs/>
+                                    <w:sz w:val="24"/>
+                                    <w:szCs w:val="24"/>
+                                    <w:lang w:bidi="ar-EG"/>
+                                  </w:rPr>
+                                  <w:t>PHONE NUMBER</w:t>
+                                </w:r>
+                              </w:sdtContent>
+                            </w:sdt>
+                          </w:p>
+                          <w:p/>
+                        </w:txbxContent>
+                      </wps:txbx>
+                      <wps:bodyPr rot="0" vert="horz" wrap="square" lIns="91440" tIns="45720" rIns="91440" bIns="45720" anchor="t" anchorCtr="0">
+                        <a:spAutoFit/>
+                      </wps:bodyPr>
+                    </wps:wsp>
+                  </a:graphicData>
+                </a:graphic>
+                <wp14:sizeRelH relativeFrom="margin">
+                  <wp14:pctWidth>40000</wp14:pctWidth>
+                </wp14:sizeRelH>
+                <wp14:sizeRelV relativeFrom="margin">
+                  <wp14:pctHeight>20000</wp14:pctHeight>
+                </wp14:sizeRelV>
+              </wp:anchor>
+            </w:drawing>
+          </mc:Choice>
+          <mc:Fallback>
+            <w:pict>
+              <v:shapetype w14:anchorId="518920C9" id="_x0000_t202" coordsize="21600,21600" o:spt="202" path="m,l,21600r21600,l21600,xe">
+                <v:stroke joinstyle="miter"/>
+                <v:path gradientshapeok="t" o:connecttype="rect"/>
+              </v:shapetype>
+              <v:shape id="Text Box 2" o:spid="_x0000_s1026" type="#_x0000_t202" style="position:absolute;left:0;text-align:left;margin-left:0;margin-top:11.7pt;width:185.9pt;height:110.6pt;z-index:251659264;visibility:visible;mso-wrap-style:square;mso-width-percent:400;mso-height-percent:200;mso-wrap-distance-left:9pt;mso-wrap-distance-top:3.6pt;mso-wrap-distance-right:9pt;mso-wrap-distance-bottom:3.6pt;mso-position-horizontal:left;mso-position-horizontal-relative:margin;mso-position-vertical:absolute;mso-position-vertical-relative:text;mso-width-percent:400;mso-height-percent:200;mso-width-relative:margin;mso-height-relative:margin;v-text-anchor:top" o:gfxdata="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" filled="f" stroked="f">
+                <v:textbox style="mso-fit-shape-to-text:t">
+                  <w:txbxContent>
+                    <w:p>
+                      <w:pPr>
+                        <w:spacing w:before="240" w:after="0"/>
+                        <w:rPr>
+                          <w:rFonts w:asciiTheme="majorBidi" w:hAnsiTheme="majorBidi" w:cstheme="majorBidi"/>
+                          <w:b/>
+                          <w:bCs/>
+                          <w:sz w:val="28"/>
+                          <w:szCs w:val="28"/>
+                          <w:u w:val="single"/>
+                          <w:rtl/>
+                          <w:lang w:bidi="ar-EG"/>
+                        </w:rPr>
+                      </w:pPr>
+                      <w:r>
+                        <w:rPr>
+                          <w:rFonts w:asciiTheme="majorBidi" w:hAnsiTheme="majorBidi" w:cstheme="majorBidi" w:hint="cs"/>
+                          <w:b/>
+                          <w:bCs/>
+                          <w:sz w:val="28"/>
+                          <w:szCs w:val="28"/>
+                          <w:u w:val="single"/>
+                          <w:rtl/>
+                          <w:lang w:bidi="ar-EG"/>
+                        </w:rPr>
+                        <w:t>بيانات مستلم</w:t>
+                      </w:r>
+                      <w:r>
+                        <w:rPr>
+                          <w:rFonts w:asciiTheme="majorBidi" w:hAnsiTheme="majorBidi" w:cstheme="majorBidi"/>
+                          <w:b/>
+                          <w:bCs/>
+                          <w:sz w:val="28"/>
+                          <w:szCs w:val="28"/>
+                          <w:u w:val="single"/>
+                          <w:rtl/>
+                          <w:lang w:bidi="ar-EG"/>
+                        </w:rPr>
+                        <w:t xml:space="preserve"> الشك</w:t>
+                      </w:r>
+                      <w:r>
+                        <w:rPr>
+                          <w:rFonts w:asciiTheme="majorBidi" w:hAnsiTheme="majorBidi" w:cstheme="majorBidi" w:hint="cs"/>
+                          <w:b/>
+                          <w:bCs/>
+                          <w:sz w:val="28"/>
+                          <w:szCs w:val="28"/>
+                          <w:u w:val="single"/>
+                          <w:rtl/>
+                          <w:lang w:bidi="ar-EG"/>
+                        </w:rPr>
+                        <w:t>وى</w:t>
+                      </w:r>
+                    </w:p>
+                    <w:p>
+                      <w:pPr>
+                        <w:spacing w:before="240" w:after="0"/>
+                        <w:rPr>
+                          <w:rFonts w:asciiTheme="majorBidi" w:hAnsiTheme="majorBidi" w:cstheme="majorBidi"/>
+                          <w:b/>
+                          <w:bCs/>
+                          <w:sz w:val="24"/>
+                          <w:szCs w:val="24"/>
+                          <w:lang w:bidi="ar-EG"/>
+                        </w:rPr>
+                      </w:pPr>
+                      <w:r>
+                        <w:rPr>
+                          <w:rFonts w:asciiTheme="majorBidi" w:hAnsiTheme="majorBidi" w:cstheme="majorBidi"/>
+                          <w:sz w:val="24"/>
+                          <w:szCs w:val="24"/>
+                          <w:rtl/>
+                          <w:lang w:bidi="ar-EG"/>
+                        </w:rPr>
+                        <w:t xml:space="preserve">الاسم: </w:t>
+                      </w:r>
+                      <w:sdt>
+                        <w:sdtPr>
+                          <w:rPr>
+                            <w:rFonts w:asciiTheme="majorBidi" w:hAnsiTheme="majorBidi" w:cstheme="majorBidi"/>
+                            <w:b/>
+                            <w:bCs/>
+                            <w:sz w:val="24"/>
+                            <w:szCs w:val="24"/>
+                            <w:rtl/>
+                            <w:lang w:bidi="ar-EG"/>
+                          </w:rPr>
+                          <w:alias w:val="username"/>
+                          <w:tag w:val="text"/>
+                          <w:id w:val="-1499108769"/>
+                          <w:placeholder>
+                            <w:docPart w:val="01B8053722134568AC3B9A6CBF5C8051"/>
+                          </w:placeholder>
+                          <w15:color w:val="000000"/>
+                          <w:text/>
+                        </w:sdtPr>
+                        <w:sdtContent>
+                          <w:r>
+                            <w:rPr>
+                              <w:rFonts w:asciiTheme="majorBidi" w:hAnsiTheme="majorBidi" w:cstheme="majorBidi"/>
+                              <w:b/>
+                              <w:bCs/>
+                              <w:sz w:val="24"/>
+                              <w:szCs w:val="24"/>
+                              <w:lang w:bidi="ar-EG"/>
+                            </w:rPr>
+                            <w:t>NAME</w:t>
+                          </w:r>
+                        </w:sdtContent>
+                      </w:sdt>
+                    </w:p>
+                    <w:p>
+                      <w:pPr>
+                        <w:spacing w:before="240" w:after="0"/>
+                        <w:rPr>
+                          <w:rFonts w:asciiTheme="majorBidi" w:hAnsiTheme="majorBidi" w:cstheme="majorBidi"/>
+                          <w:b/>
+                          <w:bCs/>
+                          <w:sz w:val="24"/>
+                          <w:szCs w:val="24"/>
+                          <w:rtl/>
+                          <w:lang w:bidi="ar-EG"/>
+                        </w:rPr>
+                      </w:pPr>
+                      <w:r>
+                        <w:rPr>
+                          <w:rFonts w:asciiTheme="majorBidi" w:hAnsiTheme="majorBidi" w:cstheme="majorBidi" w:hint="cs"/>
+                          <w:sz w:val="24"/>
+                          <w:szCs w:val="24"/>
+                          <w:rtl/>
+                          <w:lang w:bidi="ar-EG"/>
+                        </w:rPr>
+                        <w:t>الرقم القومي</w:t>
+                      </w:r>
+                      <w:r>
+                        <w:rPr>
+                          <w:rFonts w:asciiTheme="majorBidi" w:hAnsiTheme="majorBidi" w:cstheme="majorBidi" w:hint="cs"/>
+                          <w:sz w:val="24"/>
+                          <w:szCs w:val="24"/>
+                          <w:rtl/>
+                          <w:lang w:bidi="ar-EG"/>
+                        </w:rPr>
+                        <w:t xml:space="preserve">: </w:t>
+                      </w:r>
+                      <w:sdt>
+                        <w:sdtPr>
+                          <w:rPr>
+                            <w:rFonts w:asciiTheme="majorBidi" w:hAnsiTheme="majorBidi" w:cstheme="majorBidi" w:hint="cs"/>
+                            <w:b/>
+                            <w:bCs/>
+                            <w:sz w:val="24"/>
+                            <w:szCs w:val="24"/>
+                            <w:rtl/>
+                            <w:lang w:bidi="ar-EG"/>
+                          </w:rPr>
+                          <w:alias w:val="user_nationalId"/>
+                          <w:tag w:val="text"/>
+                          <w:id w:val="104402682"/>
+                          <w:placeholder>
+                            <w:docPart w:val="01B8053722134568AC3B9A6CBF5C8051"/>
+                          </w:placeholder>
+                          <w15:color w:val="000000"/>
+                          <w:text/>
+                        </w:sdtPr>
+                        <w:sdtContent>
+                          <w:r>
+                            <w:rPr>
+                              <w:rFonts w:asciiTheme="majorBidi" w:hAnsiTheme="majorBidi" w:cstheme="majorBidi"/>
+                              <w:b/>
+                              <w:bCs/>
+                              <w:sz w:val="24"/>
+                              <w:szCs w:val="24"/>
+                              <w:lang w:bidi="ar-EG"/>
+                            </w:rPr>
+                            <w:t>NATIONALID</w:t>
+                          </w:r>
+                        </w:sdtContent>
+                      </w:sdt>
+                    </w:p>
+                    <w:p>
+                      <w:pPr>
+                        <w:spacing w:before="240" w:after="0"/>
+                        <w:rPr>
+                          <w:rFonts w:asciiTheme="majorBidi" w:hAnsiTheme="majorBidi" w:cstheme="majorBidi"/>
+                          <w:sz w:val="24"/>
+                          <w:szCs w:val="24"/>
+                          <w:lang w:bidi="ar-EG"/>
+                        </w:rPr>
+                      </w:pPr>
+                      <w:r>
+                        <w:rPr>
+                          <w:rFonts w:asciiTheme="majorBidi" w:hAnsiTheme="majorBidi" w:cstheme="majorBidi"/>
+                          <w:sz w:val="24"/>
+                          <w:szCs w:val="24"/>
+                          <w:rtl/>
+                          <w:lang w:bidi="ar-EG"/>
+                        </w:rPr>
+                        <w:t xml:space="preserve">رقم الهاتف: </w:t>
+                      </w:r>
+                      <w:sdt>
+                        <w:sdtPr>
+                          <w:rPr>
+                            <w:rFonts w:asciiTheme="majorBidi" w:hAnsiTheme="majorBidi" w:cstheme="majorBidi"/>
+                            <w:b/>
+                            <w:bCs/>
+                            <w:sz w:val="24"/>
+                            <w:szCs w:val="24"/>
+                            <w:rtl/>
+                            <w:lang w:bidi="ar-EG"/>
+                          </w:rPr>
+                          <w:alias w:val="user_phone"/>
+                          <w:tag w:val="text"/>
+                          <w:id w:val="-869294125"/>
+                          <w:placeholder>
+                            <w:docPart w:val="154DBF0B8BCE4AD2B8282BFB2F773B39"/>
+                          </w:placeholder>
+                          <w15:color w:val="000000"/>
+                          <w:text/>
+                        </w:sdtPr>
+                        <w:sdtContent>
+                          <w:r>
+                            <w:rPr>
+                              <w:rFonts w:asciiTheme="majorBidi" w:hAnsiTheme="majorBidi" w:cstheme="majorBidi"/>
+                              <w:b/>
+                              <w:bCs/>
+                              <w:sz w:val="24"/>
+                              <w:szCs w:val="24"/>
+                              <w:lang w:bidi="ar-EG"/>
+                            </w:rPr>
+                            <w:t>PHONE NUMBER</w:t>
+                          </w:r>
+                        </w:sdtContent>
+                      </w:sdt>
+                    </w:p>
+                    <w:p/>
+                  </w:txbxContent>
+                </v:textbox>
+                <w10:wrap type="square" anchorx="margin"/>
+              </v:shape>
+            </w:pict>
+          </mc:Fallback>
+        </mc:AlternateContent>
+      </w:r>
     </w:p>
     <w:p>
       <w:pPr>
@@ -1109,10 +1677,9 @@
         <w:spacing w:before="240" w:after="0"/>
         <w:jc w:val="center"/>
         <w:rPr>
-          <w:rFonts w:asciiTheme="majorBidi" w:hAnsiTheme="majorBidi" w:cstheme="majorBidi" w:hint="cs"/>
+          <w:rFonts w:asciiTheme="majorBidi" w:hAnsiTheme="majorBidi" w:cstheme="majorBidi"/>
           <w:sz w:val="32"/>
           <w:szCs w:val="32"/>
-          <w:rtl/>
           <w:lang w:bidi="ar-EG"/>
         </w:rPr>
       </w:pPr>
@@ -4713,7 +5280,7 @@
   <w:style w:type="paragraph" w:default="1" w:styleId="Normal">
     <w:name w:val="Normal"/>
     <w:qFormat/>
-    <w:rsid w:val="00BA2AE2"/>
+    <w:rsid w:val="00F91989"/>
     <w:pPr>
       <w:bidi/>
     </w:pPr>
@@ -5084,6 +5651,64 @@
         </w:p>
       </w:docPartBody>
     </w:docPart>
+    <w:docPart>
+      <w:docPartPr>
+        <w:name w:val="01B8053722134568AC3B9A6CBF5C8051"/>
+        <w:category>
+          <w:name w:val="General"/>
+          <w:gallery w:val="placeholder"/>
+        </w:category>
+        <w:types>
+          <w:type w:val="bbPlcHdr"/>
+        </w:types>
+        <w:behaviors>
+          <w:behavior w:val="content"/>
+        </w:behaviors>
+        <w:guid w:val="{FAEA2055-FC0C-415E-8841-9CF592DDF6F8}"/>
+      </w:docPartPr>
+      <w:docPartBody>
+        <w:p>
+          <w:pPr>
+            <w:pStyle w:val="01B8053722134568AC3B9A6CBF5C8051"/>
+          </w:pPr>
+          <w:r>
+            <w:rPr>
+              <w:rStyle w:val="PlaceholderText"/>
+            </w:rPr>
+            <w:t>Click or tap here to enter text.</w:t>
+          </w:r>
+        </w:p>
+      </w:docPartBody>
+    </w:docPart>
+    <w:docPart>
+      <w:docPartPr>
+        <w:name w:val="154DBF0B8BCE4AD2B8282BFB2F773B39"/>
+        <w:category>
+          <w:name w:val="General"/>
+          <w:gallery w:val="placeholder"/>
+        </w:category>
+        <w:types>
+          <w:type w:val="bbPlcHdr"/>
+        </w:types>
+        <w:behaviors>
+          <w:behavior w:val="content"/>
+        </w:behaviors>
+        <w:guid w:val="{2068171B-C382-4BCD-9117-3BF35ACD82C9}"/>
+      </w:docPartPr>
+      <w:docPartBody>
+        <w:p>
+          <w:pPr>
+            <w:pStyle w:val="154DBF0B8BCE4AD2B8282BFB2F773B39"/>
+          </w:pPr>
+          <w:r>
+            <w:rPr>
+              <w:rStyle w:val="PlaceholderText"/>
+            </w:rPr>
+            <w:t>Click or tap here to enter text.</w:t>
+          </w:r>
+        </w:p>
+      </w:docPartBody>
+    </w:docPart>
   </w:docParts>
 </w:glossaryDocument>
 </file>
@@ -5217,14 +5842,15 @@
     <w:rsid w:val="004F7E1C"/>
     <w:rsid w:val="00514522"/>
     <w:rsid w:val="00536C93"/>
-    <w:rsid w:val="0055536F"/>
     <w:rsid w:val="00575565"/>
     <w:rsid w:val="005A2022"/>
     <w:rsid w:val="005D0A25"/>
     <w:rsid w:val="005D715A"/>
     <w:rsid w:val="00616D4C"/>
     <w:rsid w:val="006F5E13"/>
+    <w:rsid w:val="0071480A"/>
     <w:rsid w:val="007247D4"/>
+    <w:rsid w:val="007434B2"/>
     <w:rsid w:val="00763F32"/>
     <w:rsid w:val="007654C1"/>
     <w:rsid w:val="007A48E1"/>
@@ -5718,7 +6344,7 @@
     <w:basedOn w:val="DefaultParagraphFont"/>
     <w:uiPriority w:val="99"/>
     <w:semiHidden/>
-    <w:rsid w:val="00F07D9D"/>
+    <w:rsid w:val="0071480A"/>
     <w:rPr>
       <w:color w:val="808080"/>
     </w:rPr>
@@ -5734,6 +6360,22 @@
   <w:style w:type="paragraph" w:customStyle="1" w:styleId="6AAB6916480045EE841BCE0660240C52">
     <w:name w:val="6AAB6916480045EE841BCE0660240C52"/>
     <w:rsid w:val="00F07D9D"/>
+  </w:style>
+  <w:style w:type="paragraph" w:customStyle="1" w:styleId="CED7CE69B0FE49E7BD07F9E3F63AEE9D">
+    <w:name w:val="CED7CE69B0FE49E7BD07F9E3F63AEE9D"/>
+    <w:rsid w:val="0071480A"/>
+  </w:style>
+  <w:style w:type="paragraph" w:customStyle="1" w:styleId="5594814604DE46D787DEF2E271666761">
+    <w:name w:val="5594814604DE46D787DEF2E271666761"/>
+    <w:rsid w:val="0071480A"/>
+  </w:style>
+  <w:style w:type="paragraph" w:customStyle="1" w:styleId="01B8053722134568AC3B9A6CBF5C8051">
+    <w:name w:val="01B8053722134568AC3B9A6CBF5C8051"/>
+    <w:rsid w:val="0071480A"/>
+  </w:style>
+  <w:style w:type="paragraph" w:customStyle="1" w:styleId="154DBF0B8BCE4AD2B8282BFB2F773B39">
+    <w:name w:val="154DBF0B8BCE4AD2B8282BFB2F773B39"/>
+    <w:rsid w:val="0071480A"/>
   </w:style>
 </w:styles>
 </file>

</xml_diff>